<commit_message>
Draft: TJ Parkers GIUGE MOU commission 4 percent, paid with customer deposits
</commit_message>
<xml_diff>
--- a/assets/tjs-parkers-giuge-mou.docx
+++ b/assets/tjs-parkers-giuge-mou.docx
@@ -681,7 +681,7 @@
           <w:color w:val="1A1A1A"/>
           <w:sz w:val="22"/>
         </w:rPr>
-        <w:t>Commission: three percent (3%) of the Sale Amount, paid by TJ's to GIUGE.</w:t>
+        <w:t>Commission: four percent (4%) of the Sale Amount, paid by TJ's to GIUGE.</w:t>
       </w:r>
     </w:p>
     <w:p>
@@ -698,7 +698,7 @@
           <w:color w:val="1A1A1A"/>
           <w:sz w:val="22"/>
         </w:rPr>
-        <w:t>Worked example: a $100,000 cabin sale produces a $3,000.00 commission.</w:t>
+        <w:t>Worked example: a $100,000 cabin sale produces a $4,000.00 commission.</w:t>
       </w:r>
     </w:p>
     <w:p>
@@ -715,7 +715,7 @@
           <w:color w:val="1A1A1A"/>
           <w:sz w:val="22"/>
         </w:rPr>
-        <w:t>The same 3% applies to log railing and log accessory sales that are Covered Sales, not only full cabins.</w:t>
+        <w:t>The same 4% applies to log railing and log accessory sales that are Covered Sales, not only full cabins.</w:t>
       </w:r>
     </w:p>
     <w:p>
@@ -732,7 +732,7 @@
           <w:color w:val="1A1A1A"/>
           <w:sz w:val="22"/>
         </w:rPr>
-        <w:t>Commission is earned only when the customer has a signed purchase contract with TJ's and TJ's has received the deposit or payment milestone counsel later specifies. Suggested default: earned on TJ's receipt of the customer's first cleared payment, payable within 15 days after that receipt.</w:t>
+        <w:t>Commission is paid commensurate with TJ's receipt of each deposit under the customer's deposit schedule. As each scheduled customer deposit clears to TJ's, TJ's pays GIUGE 4% of that deposit amount within 15 days. Example: if the customer pays a $20,000 deposit on a $100,000 sale, GIUGE is paid $800 on that deposit; later deposits follow the same 4% until the full $4,000 is paid.</w:t>
       </w:r>
     </w:p>
     <w:p>
@@ -766,7 +766,7 @@
           <w:color w:val="1A1A1A"/>
           <w:sz w:val="22"/>
         </w:rPr>
-        <w:t>This is not an exclusive listing. TJ's may sell through other channels. Only Covered Sales earn the 3%.</w:t>
+        <w:t>This is not an exclusive listing. TJ's may sell through other channels. Only Covered Sales earn the 4%.</w:t>
       </w:r>
     </w:p>
     <w:p>
@@ -796,7 +796,7 @@
           <w:color w:val="1A1A1A"/>
           <w:sz w:val="22"/>
         </w:rPr>
-        <w:t>GIUGE is a qualified general contractor. If GIUGE sells a log cabin (or other Qualifying Products) on which GIUGE is also the GC, the 3% commission is excluded. That compensation is built into GIUGE's GC contract markup instead.</w:t>
+        <w:t>GIUGE is a qualified general contractor. If GIUGE sells a log cabin (or other Qualifying Products) on which GIUGE is also the GC, the 4% commission is excluded. That compensation is built into GIUGE's GC contract markup instead.</w:t>
       </w:r>
     </w:p>
     <w:tbl>
@@ -873,7 +873,9 @@
             <w:tcW w:type="dxa" w:w="4536"/>
           </w:tcPr>
           <w:p>
-            <w:r/>
+            <w:r>
+              <w:t>4% of Sale Amount</w:t>
+            </w:r>
             <w:r>
               <w:rPr>
                 <w:rFonts w:ascii="Calibri" w:hAnsi="Calibri" w:eastAsia="Calibri"/>
@@ -882,7 +884,6 @@
                 <w:color w:val="1A1A1A"/>
                 <w:sz w:val="20"/>
               </w:rPr>
-              <w:t>3% of Sale Amount</w:t>
             </w:r>
           </w:p>
         </w:tc>
@@ -979,7 +980,7 @@
           <w:color w:val="1A1A1A"/>
           <w:sz w:val="22"/>
         </w:rPr>
-        <w:t>The forfeiture applies to the entire Covered Sale, not a reduced rate. There is no 3% plus GC markup on the same job.</w:t>
+        <w:t>The forfeiture applies to the entire Covered Sale, not a reduced rate. There is no 4% plus GC markup on the same job.</w:t>
       </w:r>
     </w:p>
     <w:p>
@@ -1445,7 +1446,7 @@
           <w:color w:val="1A1A1A"/>
           <w:sz w:val="22"/>
         </w:rPr>
-        <w:t>Set the exact commission trigger (contract signed vs. deposit cleared vs. final payment).</w:t>
+        <w:t>Attach TJ's standard customer deposit schedule so the 4% commensurate-pay rule can be applied installment by installment.</w:t>
       </w:r>
     </w:p>
     <w:p>

</xml_diff>